<commit_message>
v0.4.9.8: wiki + reference pages, Mill merge, Cipher Chamber
</commit_message>
<xml_diff>
--- a/CE/Rules.docx
+++ b/CE/Rules.docx
@@ -26496,7 +26496,7 @@
           <w:b w:val="0"/>
           <w:i w:val="0"/>
         </w:rPr>
-        <w:t xml:space="preserve"> Before gaining its token, each Fatigued side's field takes a Break check: roll a D6 per retinue in the field, up to 5 dice, each ≥ its modified Morale value; failures are casualties. A Break check never triggers a Panic check, and Unbreakable auto-passes it. A check ever modified to 7 or more Routs the whole army.</w:t>
+        <w:t xml:space="preserve"> Before gaining its token, each Fatigued side's field takes a Break check: roll a D6 per retinue in the field, up to 5 dice, each ≥ its modified Morale value; failures are casualties. A Break check never triggers a Panic check. A check ever modified to 7 or more Routs the whole army.</w:t>
       </w:r>
     </w:p>
     <w:p>
@@ -26525,7 +26525,7 @@
           <w:b w:val="0"/>
           <w:i w:val="0"/>
         </w:rPr>
-        <w:t xml:space="preserve"> Each Fatigued side then gains a Fatigue token — each token is −1 to that army's Strike, Parry, Recover, and Morale rolls (to a maximum of 6+ on the rolls; Morale is uncapped). Tokens stack and last until the Battle ends.</w:t>
+        <w:t xml:space="preserve"> Each Fatigued side then gains a Fatigue token — each token is −1 to that army's Strike and Morale rolls (Strike to a maximum of 6+; Morale uncapped); while Fatigued, retinues can't Parry or Recover. Tokens stack and last until the Battle ends.</w:t>
       </w:r>
     </w:p>
     <w:p>

</xml_diff>